<commit_message>
docs: AI Insight Assistant now live on Gemini — refresh screenshot + doc
Live endpoint returns model=gemini-flash-latest, usedFallback=false. EV-02
carries the Gemini-powered chat screenshot; the S8 AI-provider row + S11
updated to state Gemini is live (rule-based fallback retained). Topic ID
S3-C-03 / Custom Track confirmed by the participant. Test count 64 -> 66.

Co-Authored-By: Claude Sonnet 5 <noreply@anthropic.com>
</commit_message>
<xml_diff>
--- a/docs/S3-C-03_ShivaRamakrishnan_FinalTermDoc.docx
+++ b/docs/S3-C-03_ShivaRamakrishnan_FinalTermDoc.docx
@@ -3785,7 +3785,7 @@
                 <w:b w:val="0"/>
                 <w:sz w:val="18"/>
               </w:rPr>
-              <w:t>~97%. All 12 deliverables Done: storefront, 9-event tracking, REST API, database, Databricks Bronze/Silver/Gold pipeline, Python ML models (churn Logistic-Regression AUC-ROC 0.888; cart-abandonment XGBoost accuracy 0.898 — both §10 targets met; conversion XGBoost AUC 0.943; K-Means k=4), collaborative-filtering recommender, AI Insight Assistant (Gemini + rule-based fallback), Orbit admin dashboard incl. engagement heatmap + session-depth funnel, a published 12-widget Databricks AI/BI dashboard, QA at 89.6% line coverage / 64 Vitest tests + a Playwright E2E purchase suite, and a LIVE public deployment (Velora https://cart-mind-web.vercel.app, Orbit https://cart-mind-admin.vercel.app, API + Postgres on Render) — verified end-to-end (Postgres -&gt; Databricks -&gt; ML -&gt; Orbit; hosted health / catalogue / admin-login green; CI green on push). Remaining (~3%, future scope, Section 10): a literal Power BI .pbix file (the BI deliverable itself is done via the published Databricks AI/BI dashboard), a scheduled JDBC Databricks Job (Free Edition has no JDBC Jobs), and formal latency/load benchmarks.</w:t>
+              <w:t>~97%. All 12 deliverables Done: storefront, 9-event tracking, REST API, database, Databricks Bronze/Silver/Gold pipeline, Python ML models (churn Logistic-Regression AUC-ROC 0.888; cart-abandonment XGBoost accuracy 0.898 — both §10 targets met; conversion XGBoost AUC 0.943; K-Means k=4), collaborative-filtering recommender, AI Insight Assistant (Gemini + rule-based fallback), Orbit admin dashboard incl. engagement heatmap + session-depth funnel, a published 12-widget Databricks AI/BI dashboard, QA at 89.6% line coverage / 66 Vitest tests + a Playwright E2E purchase suite, and a LIVE public deployment (Velora https://cart-mind-web.vercel.app, Orbit https://cart-mind-admin.vercel.app, API + Postgres on Render) — verified end-to-end (Postgres -&gt; Databricks -&gt; ML -&gt; Orbit; hosted health / catalogue / admin-login green; CI green on push). Remaining (~3%, future scope, Section 10): a literal Power BI .pbix file (the BI deliverable itself is done via the published Databricks AI/BI dashboard), a scheduled JDBC Databricks Job (Free Edition has no JDBC Jobs), and formal latency/load benchmarks.</w:t>
             </w:r>
           </w:p>
         </w:tc>
@@ -6610,7 +6610,7 @@
                 <w:b w:val="0"/>
                 <w:sz w:val="18"/>
               </w:rPr>
-              <w:t>Orbit admin dashboard is live at https://cart-mind-admin.vercel.app — revenue $31.2K, 84 orders, conversion 42.7%, revenue-trend chart, 7-day behavioral event breakdown (product_viewed 234, add_to_cart 72...), an engagement heatmap + session-depth funnel (Viewed -&gt; Cart -&gt; Checkout -&gt; Purchased), and the AI Insight Assistant (operational; runs the deterministic rule-based engine on the live deploy, auto-switches to Gemini when a valid key is set).</w:t>
+              <w:t>Orbit admin dashboard is live at https://cart-mind-admin.vercel.app — revenue $31.2K, 84 orders, conversion 42.7%, revenue-trend chart, 7-day behavioral event breakdown (product_viewed 234, add_to_cart 72...), an engagement heatmap + session-depth funnel (Viewed -&gt; Cart -&gt; Checkout -&gt; Purchased), and the AI Insight Assistant (live, Google Gemini gemini-flash-latest, with a deterministic rule-based fallback).</w:t>
             </w:r>
           </w:p>
         </w:tc>
@@ -6953,7 +6953,7 @@
       <w:r>
         <w:drawing>
           <wp:inline xmlns:a="http://schemas.openxmlformats.org/drawingml/2006/main" xmlns:pic="http://schemas.openxmlformats.org/drawingml/2006/picture">
-            <wp:extent cx="5669280" cy="5529544"/>
+            <wp:extent cx="5669280" cy="5828978"/>
             <wp:docPr id="6" name="Picture 6"/>
             <wp:cNvGraphicFramePr>
               <a:graphicFrameLocks noChangeAspect="1"/>
@@ -6974,7 +6974,7 @@
                   <pic:spPr>
                     <a:xfrm>
                       <a:off x="0" y="0"/>
-                      <a:ext cx="5669280" cy="5529544"/>
+                      <a:ext cx="5669280" cy="5828978"/>
                     </a:xfrm>
                     <a:prstGeom prst="rect"/>
                   </pic:spPr>
@@ -10238,7 +10238,7 @@
           <w:i w:val="0"/>
           <w:sz w:val="24"/>
         </w:rPr>
-        <w:t>EV-09 — QA: 64 tests passing, 89.6% coverage, CI green</w:t>
+        <w:t>EV-09 — QA: 66 tests passing, 89.6% coverage, CI green</w:t>
       </w:r>
     </w:p>
     <w:tbl>
@@ -10336,7 +10336,7 @@
                 <w:b w:val="0"/>
                 <w:sz w:val="18"/>
               </w:rPr>
-              <w:t>64 Vitest tests passing, 0 skipped, 0 todo (up from 15 passing / 32 todo at Mid-Term). DB-backed integration suites for auth, products, orders, banners, admin, events (single + batch), engagement; pure-unit for coupons + ML predict. v8 coverage: 89.57% lines, 76.89% branches, 92.45% functions (src/routes 90.9%, src/lib/ml 94.4%, src/services + src/utils + src/db + src/app 100%). GitHub Actions CI: build shared types -&gt; migrate/seed Postgres -&gt; build apps -&gt; integration tests -&gt; lint, plus a dedicated Playwright E2E job, on every push/PR. Also fixed at final term: apps/api and apps/admin had a lint script but no eslint config, so CI lint had never actually passed — flat configs added, `npm run lint --workspaces` now exits 0. Details: docs/screenshots/COVERAGE.md.</w:t>
+              <w:t>66 Vitest tests passing, 0 skipped, 0 todo (up from 15 passing / 32 todo at Mid-Term). DB-backed integration suites for auth, products, orders, banners, admin, events (single + batch), engagement; pure-unit for coupons + ML predict. v8 coverage: 89.57% lines, 76.89% branches, 92.45% functions (src/routes 90.9%, src/lib/ml 94.4%, src/services + src/utils + src/db + src/app 100%). GitHub Actions CI: build shared types -&gt; migrate/seed Postgres -&gt; build apps -&gt; integration tests -&gt; lint, plus a dedicated Playwright E2E job, on every push/PR. Also fixed at final term: apps/api and apps/admin had a lint script but no eslint config, so CI lint had never actually passed — flat configs added, `npm run lint --workspaces` now exits 0. Details: docs/screenshots/COVERAGE.md.</w:t>
             </w:r>
           </w:p>
         </w:tc>
@@ -13134,7 +13134,7 @@
                 <w:b w:val="0"/>
                 <w:sz w:val="18"/>
               </w:rPr>
-              <w:t>API integration tests (Vitest + supertest, seeded Postgres) — auth, products, orders, banners, admin, events (single + batch), engagement, health</w:t>
+              <w:t>API integration tests (Vitest + supertest, seeded Postgres) — auth, products, orders, banners, admin, events (single + batch), engagement, latency, health</w:t>
             </w:r>
           </w:p>
         </w:tc>
@@ -13162,7 +13162,7 @@
                 <w:b w:val="0"/>
                 <w:sz w:val="18"/>
               </w:rPr>
-              <w:t>56 integration cases across 9 suites</w:t>
+              <w:t>58 integration cases across 10 suites</w:t>
             </w:r>
           </w:p>
         </w:tc>
@@ -16637,7 +16637,7 @@
                 <w:b w:val="0"/>
                 <w:sz w:val="18"/>
               </w:rPr>
-              <w:t>Project / topic</w:t>
+              <w:t>Project / topic (note, not a deviation)</w:t>
             </w:r>
           </w:p>
         </w:tc>
@@ -16665,7 +16665,7 @@
                 <w:b w:val="0"/>
                 <w:sz w:val="18"/>
               </w:rPr>
-              <w:t>Topic S3-C-03 (the RFP originally on file for this slot was a different concept, "TalentPulse AI")</w:t>
+              <w:t>Topic ID S3-C-03, Custom Track</w:t>
             </w:r>
           </w:p>
         </w:tc>
@@ -16693,7 +16693,7 @@
                 <w:b w:val="0"/>
                 <w:sz w:val="18"/>
               </w:rPr>
-              <w:t>CartMind AI — Behavioral Analytics E-commerce Platform, as built and delivered at Mid-Term and Final Term under Topic ID S3-C-03.</w:t>
+              <w:t>CartMind AI — Behavioral Analytics E-commerce Platform, built and delivered under Topic ID S3-C-03 (Custom Track) across Mid-Term and Final Term.</w:t>
             </w:r>
           </w:p>
         </w:tc>
@@ -16721,7 +16721,7 @@
                 <w:b w:val="0"/>
                 <w:sz w:val="18"/>
               </w:rPr>
-              <w:t>The CartMind AI scope was the one developed, reviewed and evaluated throughout the programme (Mid-Term evaluation was issued against CartMind AI). Flagged here for transparency per the Mid-Term note; Topic ID to be confirmed with L&amp;D.</w:t>
+              <w:t>No scope deviation. The Mid-Term evaluation report noted an older RFP entry against this slot; the participant has confirmed S3-C-03 / Custom Track / CartMind AI as the correct assignment. Included here only for record continuity with the Mid-Term.</w:t>
             </w:r>
           </w:p>
         </w:tc>
@@ -16822,7 +16822,7 @@
                 <w:b w:val="0"/>
                 <w:sz w:val="18"/>
               </w:rPr>
-              <w:t>Google Gemini REST API (free tier), integrated and used when a valid GEMINI_API_KEY is set, with a deterministic rule-based engine as the always-available fallback (same feature: NL answers over live dashboard context). The hosted deployment currently serves the rule-based engine — the key available at deploy time did not validate; the Gemini path switches in automatically once a valid key is set, with no code change.</w:t>
+              <w:t>Google Gemini REST API — model gemini-flash-latest, free tier — live on the hosted deployment, with a deterministic rule-based engine as the always-available fallback (same feature: NL answers over live dashboard context; POST /api/v1/admin/insights/chat returns model=gemini-flash-latest, usedFallback=false).</w:t>
             </w:r>
           </w:p>
         </w:tc>
@@ -20060,7 +20060,7 @@
                 <w:b w:val="0"/>
                 <w:sz w:val="18"/>
               </w:rPr>
-              <w:t>Cart-abandonment retrained to accuracy 0.898 (target &gt; 0.85) via a two-component friction mixture + payment probability tied to observable funnel ratios. Test suite 15 -&gt; 64 passing (0 todo); line coverage 54% -&gt; 89.6%; Playwright E2E added.</w:t>
+              <w:t>Cart-abandonment retrained to accuracy 0.898 (target &gt; 0.85) via a two-component friction mixture + payment probability tied to observable funnel ratios. Test suite 15 -&gt; 66 passing (0 todo); line coverage 54% -&gt; 89.6%; Playwright E2E added.</w:t>
             </w:r>
           </w:p>
         </w:tc>
@@ -20122,7 +20122,7 @@
                 <w:b w:val="0"/>
                 <w:sz w:val="18"/>
               </w:rPr>
-              <w:t>Section 8 now lists 8 deviations with reasons (project/topic note, provider swap, BI tool, Databricks tier, auth, ML runtime, CDP, live AI provider). Deployment is live (EV-11); the AI Insight Assistant is operational on the hosted deploy (rule-based engine; Gemini auto-engages with a valid key).</w:t>
+              <w:t>Section 8 now lists the deviations with reasons (BI tool, Databricks tier, auth, ML runtime, CDP, AI provider) plus a record-continuity note on the topic ID. Deployment is live (EV-11); the AI Insight Assistant is operational on the hosted deploy with Google Gemini (gemini-flash-latest), rule-based engine as fallback.</w:t>
             </w:r>
           </w:p>
         </w:tc>

</xml_diff>